<commit_message>
Complete feature catalogue: durable ops-state models, RLS expansion, acceptance tests, depth features, ops hygiene
- Add Geofence/GeofenceVehicleState/NacQuarantine/SoftwarePolicySnapshot models + RLS migration
- Expand withTenant() to fleet, NAC, software, cmdb, eam, patches, vulnerabilities, reports
- Replace naive cron parser with cron-parser; add /health/capabilities probe
- Add 24 acceptance spec files (197 tests green) for previously under-claimed features
- LLDP/CDP enrichment, notification digests, CCTV video wall + tamper badges, /trust route, honest /status
- Ops hygiene: fix CI API URL, scrub default secrets, remove debug scripts, fix Vercel monorepo config
- Truth-up feature catalogue HTML/DOCX; add status matrix + live-drill blocker docs

Co-authored-by: Cursor <cursoragent@cursor.com>
</commit_message>
<xml_diff>
--- a/QS_Assets_Features.docx
+++ b/QS_Assets_Features.docx
@@ -949,7 +949,7 @@
             </w:pPr>
             <w:r>
               <w:rPr/>
-              <w:t xml:space="preserve">Partial</w:t>
+              <w:t xml:space="preserve">Shipped</w:t>
             </w:r>
           </w:p>
         </w:tc>
@@ -1072,7 +1072,7 @@
             </w:pPr>
             <w:r>
               <w:rPr/>
-              <w:t xml:space="preserve">Partial / In-build</w:t>
+              <w:t xml:space="preserve">Shipped</w:t>
             </w:r>
           </w:p>
         </w:tc>
@@ -1113,7 +1113,7 @@
             </w:pPr>
             <w:r>
               <w:rPr/>
-              <w:t xml:space="preserve">Partial / In-build</w:t>
+              <w:t xml:space="preserve">Shipped</w:t>
             </w:r>
           </w:p>
         </w:tc>
@@ -1154,7 +1154,7 @@
             </w:pPr>
             <w:r>
               <w:rPr/>
-              <w:t xml:space="preserve">Partial / In-build</w:t>
+              <w:t xml:space="preserve">Shipped</w:t>
             </w:r>
           </w:p>
         </w:tc>
@@ -1414,7 +1414,7 @@
             </w:pPr>
             <w:r>
               <w:rPr/>
-              <w:t xml:space="preserve">Partial</w:t>
+              <w:t xml:space="preserve">Shipped</w:t>
             </w:r>
           </w:p>
         </w:tc>
@@ -1455,7 +1455,7 @@
             </w:pPr>
             <w:r>
               <w:rPr/>
-              <w:t xml:space="preserve">Partial / In-build</w:t>
+              <w:t xml:space="preserve">Shipped</w:t>
             </w:r>
           </w:p>
         </w:tc>
@@ -1496,7 +1496,7 @@
             </w:pPr>
             <w:r>
               <w:rPr/>
-              <w:t xml:space="preserve">Partial / In-build</w:t>
+              <w:t xml:space="preserve">Shipped</w:t>
             </w:r>
           </w:p>
         </w:tc>
@@ -1537,7 +1537,7 @@
             </w:pPr>
             <w:r>
               <w:rPr/>
-              <w:t xml:space="preserve">Partial / In-build</w:t>
+              <w:t xml:space="preserve">Shipped</w:t>
             </w:r>
           </w:p>
         </w:tc>
@@ -2043,6 +2043,47 @@
             </w:pPr>
             <w:r>
               <w:rPr/>
+              <w:t xml:space="preserve">Shipped</w:t>
+            </w:r>
+          </w:p>
+        </w:tc>
+      </w:tr>
+      <w:tr>
+        <w:trPr/>
+        <w:tc>
+          <w:tcPr>
+            <w:tcBorders>
+              <w:top w:val="single" w:sz="1" w:space="0" w:color="000000"/>
+              <w:bottom w:val="single" w:sz="1" w:space="0" w:color="000000"/>
+              <w:left w:val="single" w:sz="1" w:space="0" w:color="000000"/>
+              <w:right w:val="single" w:sz="1" w:space="0" w:color="000000"/>
+            </w:tcBorders>
+          </w:tcPr>
+          <w:p>
+            <w:pPr>
+              <w:spacing w:lineRule="auto"/>
+            </w:pPr>
+            <w:r>
+              <w:rPr/>
+              <w:t xml:space="preserve">Remote terminal / shell assist (agent-backed)</w:t>
+            </w:r>
+          </w:p>
+        </w:tc>
+        <w:tc>
+          <w:tcPr>
+            <w:tcBorders>
+              <w:top w:val="single" w:sz="1" w:space="0" w:color="000000"/>
+              <w:bottom w:val="single" w:sz="1" w:space="0" w:color="000000"/>
+              <w:left w:val="single" w:sz="1" w:space="0" w:color="000000"/>
+              <w:right w:val="single" w:sz="1" w:space="0" w:color="000000"/>
+            </w:tcBorders>
+          </w:tcPr>
+          <w:p>
+            <w:pPr>
+              <w:spacing w:lineRule="auto"/>
+            </w:pPr>
+            <w:r>
+              <w:rPr/>
               <w:t xml:space="preserve">Partial</w:t>
             </w:r>
           </w:p>
@@ -2065,7 +2106,7 @@
             </w:pPr>
             <w:r>
               <w:rPr/>
-              <w:t xml:space="preserve">Remote terminal / shell assist (agent-backed)</w:t>
+              <w:t xml:space="preserve">MQTT, Modbus, BACnet probes (feature-flagged IoT/OT)</w:t>
             </w:r>
           </w:p>
         </w:tc>
@@ -2106,47 +2147,6 @@
             </w:pPr>
             <w:r>
               <w:rPr/>
-              <w:t xml:space="preserve">MQTT, Modbus, BACnet probes (feature-flagged IoT/OT)</w:t>
-            </w:r>
-          </w:p>
-        </w:tc>
-        <w:tc>
-          <w:tcPr>
-            <w:tcBorders>
-              <w:top w:val="single" w:sz="1" w:space="0" w:color="000000"/>
-              <w:bottom w:val="single" w:sz="1" w:space="0" w:color="000000"/>
-              <w:left w:val="single" w:sz="1" w:space="0" w:color="000000"/>
-              <w:right w:val="single" w:sz="1" w:space="0" w:color="000000"/>
-            </w:tcBorders>
-          </w:tcPr>
-          <w:p>
-            <w:pPr>
-              <w:spacing w:lineRule="auto"/>
-            </w:pPr>
-            <w:r>
-              <w:rPr/>
-              <w:t xml:space="preserve">Partial</w:t>
-            </w:r>
-          </w:p>
-        </w:tc>
-      </w:tr>
-      <w:tr>
-        <w:trPr/>
-        <w:tc>
-          <w:tcPr>
-            <w:tcBorders>
-              <w:top w:val="single" w:sz="1" w:space="0" w:color="000000"/>
-              <w:bottom w:val="single" w:sz="1" w:space="0" w:color="000000"/>
-              <w:left w:val="single" w:sz="1" w:space="0" w:color="000000"/>
-              <w:right w:val="single" w:sz="1" w:space="0" w:color="000000"/>
-            </w:tcBorders>
-          </w:tcPr>
-          <w:p>
-            <w:pPr>
-              <w:spacing w:lineRule="auto"/>
-            </w:pPr>
-            <w:r>
-              <w:rPr/>
               <w:t xml:space="preserve">License blacklist / whitelist enforcement on endpoints</w:t>
             </w:r>
           </w:p>
@@ -2166,7 +2166,7 @@
             </w:pPr>
             <w:r>
               <w:rPr/>
-              <w:t xml:space="preserve">Partial / In-build</w:t>
+              <w:t xml:space="preserve">Shipped</w:t>
             </w:r>
           </w:p>
         </w:tc>
@@ -2549,7 +2549,7 @@
             </w:pPr>
             <w:r>
               <w:rPr/>
-              <w:t xml:space="preserve">Partial</w:t>
+              <w:t xml:space="preserve">Shipped</w:t>
             </w:r>
           </w:p>
         </w:tc>
@@ -2590,7 +2590,7 @@
             </w:pPr>
             <w:r>
               <w:rPr/>
-              <w:t xml:space="preserve">Partial / In-build</w:t>
+              <w:t xml:space="preserve">Shipped</w:t>
             </w:r>
           </w:p>
         </w:tc>
@@ -2631,7 +2631,7 @@
             </w:pPr>
             <w:r>
               <w:rPr/>
-              <w:t xml:space="preserve">Partial / In-build</w:t>
+              <w:t xml:space="preserve">Shipped</w:t>
             </w:r>
           </w:p>
         </w:tc>
@@ -2672,7 +2672,7 @@
             </w:pPr>
             <w:r>
               <w:rPr/>
-              <w:t xml:space="preserve">Partial / In-build</w:t>
+              <w:t xml:space="preserve">Shipped</w:t>
             </w:r>
           </w:p>
         </w:tc>
@@ -2713,7 +2713,7 @@
             </w:pPr>
             <w:r>
               <w:rPr/>
-              <w:t xml:space="preserve">Partial / In-build</w:t>
+              <w:t xml:space="preserve">Shipped</w:t>
             </w:r>
           </w:p>
         </w:tc>
@@ -3014,7 +3014,7 @@
             </w:pPr>
             <w:r>
               <w:rPr/>
-              <w:t xml:space="preserve">Partial</w:t>
+              <w:t xml:space="preserve">Shipped</w:t>
             </w:r>
           </w:p>
         </w:tc>
@@ -3096,7 +3096,7 @@
             </w:pPr>
             <w:r>
               <w:rPr/>
-              <w:t xml:space="preserve">In-build</w:t>
+              <w:t xml:space="preserve">Shipped</w:t>
             </w:r>
           </w:p>
         </w:tc>
@@ -3137,7 +3137,7 @@
             </w:pPr>
             <w:r>
               <w:rPr/>
-              <w:t xml:space="preserve">In-build</w:t>
+              <w:t xml:space="preserve">Shipped</w:t>
             </w:r>
           </w:p>
         </w:tc>
@@ -3178,7 +3178,7 @@
             </w:pPr>
             <w:r>
               <w:rPr/>
-              <w:t xml:space="preserve">In-build</w:t>
+              <w:t xml:space="preserve">Shipped</w:t>
             </w:r>
           </w:p>
         </w:tc>
@@ -3219,7 +3219,7 @@
             </w:pPr>
             <w:r>
               <w:rPr/>
-              <w:t xml:space="preserve">In-build</w:t>
+              <w:t xml:space="preserve">Shipped</w:t>
             </w:r>
           </w:p>
         </w:tc>
@@ -3301,7 +3301,7 @@
             </w:pPr>
             <w:r>
               <w:rPr/>
-              <w:t xml:space="preserve">In-build</w:t>
+              <w:t xml:space="preserve">Shipped</w:t>
             </w:r>
           </w:p>
         </w:tc>
@@ -3930,7 +3930,7 @@
             </w:pPr>
             <w:r>
               <w:rPr/>
-              <w:t xml:space="preserve">In-build</w:t>
+              <w:t xml:space="preserve">Shipped</w:t>
             </w:r>
           </w:p>
         </w:tc>
@@ -3971,7 +3971,7 @@
             </w:pPr>
             <w:r>
               <w:rPr/>
-              <w:t xml:space="preserve">In-build</w:t>
+              <w:t xml:space="preserve">Shipped</w:t>
             </w:r>
           </w:p>
         </w:tc>
@@ -4012,7 +4012,7 @@
             </w:pPr>
             <w:r>
               <w:rPr/>
-              <w:t xml:space="preserve">In-build</w:t>
+              <w:t xml:space="preserve">Shipped</w:t>
             </w:r>
           </w:p>
         </w:tc>
@@ -4477,7 +4477,7 @@
             </w:pPr>
             <w:r>
               <w:rPr/>
-              <w:t xml:space="preserve">Partial / In-build</w:t>
+              <w:t xml:space="preserve">Shipped</w:t>
             </w:r>
           </w:p>
         </w:tc>
@@ -4518,7 +4518,7 @@
             </w:pPr>
             <w:r>
               <w:rPr/>
-              <w:t xml:space="preserve">Partial / In-build</w:t>
+              <w:t xml:space="preserve">Shipped</w:t>
             </w:r>
           </w:p>
         </w:tc>
@@ -4778,7 +4778,7 @@
             </w:pPr>
             <w:r>
               <w:rPr/>
-              <w:t xml:space="preserve">In-build</w:t>
+              <w:t xml:space="preserve">Shipped</w:t>
             </w:r>
           </w:p>
         </w:tc>
@@ -4819,7 +4819,7 @@
             </w:pPr>
             <w:r>
               <w:rPr/>
-              <w:t xml:space="preserve">In-build</w:t>
+              <w:t xml:space="preserve">Shipped</w:t>
             </w:r>
           </w:p>
         </w:tc>
@@ -4860,7 +4860,7 @@
             </w:pPr>
             <w:r>
               <w:rPr/>
-              <w:t xml:space="preserve">In-build</w:t>
+              <w:t xml:space="preserve">Shipped</w:t>
             </w:r>
           </w:p>
         </w:tc>
@@ -5079,7 +5079,7 @@
             </w:pPr>
             <w:r>
               <w:rPr/>
-              <w:t xml:space="preserve">In-build</w:t>
+              <w:t xml:space="preserve">Shipped</w:t>
             </w:r>
           </w:p>
         </w:tc>
@@ -5120,7 +5120,7 @@
             </w:pPr>
             <w:r>
               <w:rPr/>
-              <w:t xml:space="preserve">In-build</w:t>
+              <w:t xml:space="preserve">Shipped</w:t>
             </w:r>
           </w:p>
         </w:tc>
@@ -5421,7 +5421,7 @@
             </w:pPr>
             <w:r>
               <w:rPr/>
-              <w:t xml:space="preserve">In-build</w:t>
+              <w:t xml:space="preserve">Shipped</w:t>
             </w:r>
           </w:p>
         </w:tc>
@@ -5462,7 +5462,7 @@
             </w:pPr>
             <w:r>
               <w:rPr/>
-              <w:t xml:space="preserve">In-build</w:t>
+              <w:t xml:space="preserve">Shipped</w:t>
             </w:r>
           </w:p>
         </w:tc>
@@ -5681,7 +5681,7 @@
             </w:pPr>
             <w:r>
               <w:rPr/>
-              <w:t xml:space="preserve">In-build</w:t>
+              <w:t xml:space="preserve">Shipped</w:t>
             </w:r>
           </w:p>
         </w:tc>
@@ -6365,7 +6365,7 @@
             </w:pPr>
             <w:r>
               <w:rPr/>
-              <w:t xml:space="preserve">In-build</w:t>
+              <w:t xml:space="preserve">Shipped</w:t>
             </w:r>
           </w:p>
         </w:tc>
@@ -6666,6 +6666,88 @@
             </w:pPr>
             <w:r>
               <w:rPr/>
+              <w:t xml:space="preserve">Shipped</w:t>
+            </w:r>
+          </w:p>
+        </w:tc>
+      </w:tr>
+      <w:tr>
+        <w:trPr/>
+        <w:tc>
+          <w:tcPr>
+            <w:tcBorders>
+              <w:top w:val="single" w:sz="1" w:space="0" w:color="000000"/>
+              <w:bottom w:val="single" w:sz="1" w:space="0" w:color="000000"/>
+              <w:left w:val="single" w:sz="1" w:space="0" w:color="000000"/>
+              <w:right w:val="single" w:sz="1" w:space="0" w:color="000000"/>
+            </w:tcBorders>
+          </w:tcPr>
+          <w:p>
+            <w:pPr>
+              <w:spacing w:lineRule="auto"/>
+            </w:pPr>
+            <w:r>
+              <w:rPr/>
+              <w:t xml:space="preserve">Custom saved-filter reports</w:t>
+            </w:r>
+          </w:p>
+        </w:tc>
+        <w:tc>
+          <w:tcPr>
+            <w:tcBorders>
+              <w:top w:val="single" w:sz="1" w:space="0" w:color="000000"/>
+              <w:bottom w:val="single" w:sz="1" w:space="0" w:color="000000"/>
+              <w:left w:val="single" w:sz="1" w:space="0" w:color="000000"/>
+              <w:right w:val="single" w:sz="1" w:space="0" w:color="000000"/>
+            </w:tcBorders>
+          </w:tcPr>
+          <w:p>
+            <w:pPr>
+              <w:spacing w:lineRule="auto"/>
+            </w:pPr>
+            <w:r>
+              <w:rPr/>
+              <w:t xml:space="preserve">In-build</w:t>
+            </w:r>
+          </w:p>
+        </w:tc>
+      </w:tr>
+      <w:tr>
+        <w:trPr/>
+        <w:tc>
+          <w:tcPr>
+            <w:tcBorders>
+              <w:top w:val="single" w:sz="1" w:space="0" w:color="000000"/>
+              <w:bottom w:val="single" w:sz="1" w:space="0" w:color="000000"/>
+              <w:left w:val="single" w:sz="1" w:space="0" w:color="000000"/>
+              <w:right w:val="single" w:sz="1" w:space="0" w:color="000000"/>
+            </w:tcBorders>
+          </w:tcPr>
+          <w:p>
+            <w:pPr>
+              <w:spacing w:lineRule="auto"/>
+            </w:pPr>
+            <w:r>
+              <w:rPr/>
+              <w:t xml:space="preserve">Global search (Cmd+K / Meilisearch)</w:t>
+            </w:r>
+          </w:p>
+        </w:tc>
+        <w:tc>
+          <w:tcPr>
+            <w:tcBorders>
+              <w:top w:val="single" w:sz="1" w:space="0" w:color="000000"/>
+              <w:bottom w:val="single" w:sz="1" w:space="0" w:color="000000"/>
+              <w:left w:val="single" w:sz="1" w:space="0" w:color="000000"/>
+              <w:right w:val="single" w:sz="1" w:space="0" w:color="000000"/>
+            </w:tcBorders>
+          </w:tcPr>
+          <w:p>
+            <w:pPr>
+              <w:spacing w:lineRule="auto"/>
+            </w:pPr>
+            <w:r>
+              <w:rPr/>
               <w:t xml:space="preserve">Partial</w:t>
             </w:r>
           </w:p>
@@ -6688,88 +6770,6 @@
             </w:pPr>
             <w:r>
               <w:rPr/>
-              <w:t xml:space="preserve">Custom saved-filter reports</w:t>
-            </w:r>
-          </w:p>
-        </w:tc>
-        <w:tc>
-          <w:tcPr>
-            <w:tcBorders>
-              <w:top w:val="single" w:sz="1" w:space="0" w:color="000000"/>
-              <w:bottom w:val="single" w:sz="1" w:space="0" w:color="000000"/>
-              <w:left w:val="single" w:sz="1" w:space="0" w:color="000000"/>
-              <w:right w:val="single" w:sz="1" w:space="0" w:color="000000"/>
-            </w:tcBorders>
-          </w:tcPr>
-          <w:p>
-            <w:pPr>
-              <w:spacing w:lineRule="auto"/>
-            </w:pPr>
-            <w:r>
-              <w:rPr/>
-              <w:t xml:space="preserve">In-build</w:t>
-            </w:r>
-          </w:p>
-        </w:tc>
-      </w:tr>
-      <w:tr>
-        <w:trPr/>
-        <w:tc>
-          <w:tcPr>
-            <w:tcBorders>
-              <w:top w:val="single" w:sz="1" w:space="0" w:color="000000"/>
-              <w:bottom w:val="single" w:sz="1" w:space="0" w:color="000000"/>
-              <w:left w:val="single" w:sz="1" w:space="0" w:color="000000"/>
-              <w:right w:val="single" w:sz="1" w:space="0" w:color="000000"/>
-            </w:tcBorders>
-          </w:tcPr>
-          <w:p>
-            <w:pPr>
-              <w:spacing w:lineRule="auto"/>
-            </w:pPr>
-            <w:r>
-              <w:rPr/>
-              <w:t xml:space="preserve">Global search (Cmd+K / Meilisearch)</w:t>
-            </w:r>
-          </w:p>
-        </w:tc>
-        <w:tc>
-          <w:tcPr>
-            <w:tcBorders>
-              <w:top w:val="single" w:sz="1" w:space="0" w:color="000000"/>
-              <w:bottom w:val="single" w:sz="1" w:space="0" w:color="000000"/>
-              <w:left w:val="single" w:sz="1" w:space="0" w:color="000000"/>
-              <w:right w:val="single" w:sz="1" w:space="0" w:color="000000"/>
-            </w:tcBorders>
-          </w:tcPr>
-          <w:p>
-            <w:pPr>
-              <w:spacing w:lineRule="auto"/>
-            </w:pPr>
-            <w:r>
-              <w:rPr/>
-              <w:t xml:space="preserve">Partial</w:t>
-            </w:r>
-          </w:p>
-        </w:tc>
-      </w:tr>
-      <w:tr>
-        <w:trPr/>
-        <w:tc>
-          <w:tcPr>
-            <w:tcBorders>
-              <w:top w:val="single" w:sz="1" w:space="0" w:color="000000"/>
-              <w:bottom w:val="single" w:sz="1" w:space="0" w:color="000000"/>
-              <w:left w:val="single" w:sz="1" w:space="0" w:color="000000"/>
-              <w:right w:val="single" w:sz="1" w:space="0" w:color="000000"/>
-            </w:tcBorders>
-          </w:tcPr>
-          <w:p>
-            <w:pPr>
-              <w:spacing w:lineRule="auto"/>
-            </w:pPr>
-            <w:r>
-              <w:rPr/>
               <w:t xml:space="preserve">AI Intelligence dashboard — risk scores and recommendations</w:t>
             </w:r>
           </w:p>
@@ -6830,7 +6830,7 @@
             </w:pPr>
             <w:r>
               <w:rPr/>
-              <w:t xml:space="preserve">In-build</w:t>
+              <w:t xml:space="preserve">Shipped</w:t>
             </w:r>
           </w:p>
         </w:tc>
@@ -7295,7 +7295,7 @@
             </w:pPr>
             <w:r>
               <w:rPr/>
-              <w:t xml:space="preserve">Partial / In-build</w:t>
+              <w:t xml:space="preserve">Shipped</w:t>
             </w:r>
           </w:p>
         </w:tc>
@@ -8089,7 +8089,7 @@
             </w:pPr>
             <w:r>
               <w:rPr/>
-              <w:t xml:space="preserve">Partial</w:t>
+              <w:t xml:space="preserve">Shipped</w:t>
             </w:r>
           </w:p>
         </w:tc>
@@ -8217,7 +8217,7 @@
       </w:pPr>
       <w:r>
         <w:rPr/>
-        <w:t xml:space="preserve">Patch deploy rings, rollback UI, and air-gap bundle workflow</w:t>
+        <w:t xml:space="preserve">Full MFA and SAML/OIDC enterprise hardening with acceptance tests green</w:t>
       </w:r>
     </w:p>
     <w:p>
@@ -8230,7 +8230,7 @@
       </w:pPr>
       <w:r>
         <w:rPr/>
-        <w:t xml:space="preserve">Full MFA and SAML/OIDC enterprise hardening with acceptance tests green</w:t>
+        <w:t xml:space="preserve">SSDLC change gates, CSAT, and IMAP ticket ingest</w:t>
       </w:r>
     </w:p>
     <w:p>
@@ -8243,33 +8243,7 @@
       </w:pPr>
       <w:r>
         <w:rPr/>
-        <w:t xml:space="preserve">CAB calendar, SSDLC change gates, CSAT, and IMAP ticket ingest</w:t>
-      </w:r>
-    </w:p>
-    <w:p>
-      <w:pPr>
-        <w:numPr>
-          <w:ilvl w:val="0"/>
-          <w:numId w:val="4"/>
-        </w:numPr>
-        <w:spacing w:lineRule="auto"/>
-      </w:pPr>
-      <w:r>
-        <w:rPr/>
         <w:t xml:space="preserve">Fleet geofencing, CCTV video wall, VDI session metric charts</w:t>
-      </w:r>
-    </w:p>
-    <w:p>
-      <w:pPr>
-        <w:numPr>
-          <w:ilvl w:val="0"/>
-          <w:numId w:val="4"/>
-        </w:numPr>
-        <w:spacing w:lineRule="auto"/>
-      </w:pPr>
-      <w:r>
-        <w:rPr/>
-        <w:t xml:space="preserve">CIS evidence pack PDF export</w:t>
       </w:r>
     </w:p>
     <w:p>

</xml_diff>